<commit_message>
Resume download now serves a one-page PDF
</commit_message>
<xml_diff>
--- a/assets/resume.docx
+++ b/assets/resume.docx
@@ -62,7 +62,7 @@
         <w:pBdr>
           <w:bottom w:val="single" w:color="D9DDE4" w:sz="8" w:space="2"/>
         </w:pBdr>
-        <w:spacing w:before="200" w:after="80" w:line="240" w:lineRule="auto"/>
+        <w:spacing w:before="140" w:after="60" w:line="240" w:lineRule="auto"/>
       </w:pPr>
       <w:r>
         <w:rPr>
@@ -81,7 +81,7 @@
         <w:tabs>
           <w:tab w:val="right" w:pos="10486"/>
         </w:tabs>
-        <w:spacing w:before="120" w:after="40" w:line="240" w:lineRule="auto"/>
+        <w:spacing w:before="100" w:after="40" w:line="240" w:lineRule="auto"/>
       </w:pPr>
       <w:r>
         <w:rPr>
@@ -116,7 +116,7 @@
     </w:p>
     <w:p>
       <w:pPr>
-        <w:spacing w:before="0" w:after="40" w:line="259" w:lineRule="auto"/>
+        <w:spacing w:before="0" w:after="40" w:line="247" w:lineRule="auto"/>
       </w:pPr>
       <w:r>
         <w:rPr>
@@ -131,26 +131,11 @@
     </w:p>
     <w:p>
       <w:pPr>
-        <w:spacing w:before="0" w:after="40" w:line="259" w:lineRule="auto"/>
-      </w:pPr>
-      <w:r>
-        <w:rPr>
-          <w:rFonts w:ascii="微软雅黑" w:hAnsi="微软雅黑" w:eastAsia="微软雅黑" w:hint="eastAsia"/>
-          <w:b w:val="0"/>
-          <w:color w:val="19232D"/>
-          <w:sz w:val="20"/>
-          <w:szCs w:val="20"/>
-        </w:rPr>
-        <w:t xml:space="preserve">担任班级宣传委员、朋辈招生负责人，连续两年参与迎新工作；参加社会实践与劳动志愿活动，志愿时长累计 150 小时。</w:t>
-      </w:r>
-    </w:p>
-    <w:p>
-      <w:pPr>
         <w:keepNext/>
         <w:pBdr>
           <w:bottom w:val="single" w:color="D9DDE4" w:sz="8" w:space="2"/>
         </w:pBdr>
-        <w:spacing w:before="200" w:after="80" w:line="240" w:lineRule="auto"/>
+        <w:spacing w:before="140" w:after="60" w:line="240" w:lineRule="auto"/>
       </w:pPr>
       <w:r>
         <w:rPr>
@@ -169,7 +154,7 @@
         <w:tabs>
           <w:tab w:val="right" w:pos="10486"/>
         </w:tabs>
-        <w:spacing w:before="160" w:after="40" w:line="240" w:lineRule="auto"/>
+        <w:spacing w:before="120" w:after="20" w:line="240" w:lineRule="auto"/>
       </w:pPr>
       <w:r>
         <w:rPr>
@@ -204,22 +189,7 @@
     </w:p>
     <w:p>
       <w:pPr>
-        <w:spacing w:before="0" w:after="40" w:line="259" w:lineRule="auto"/>
-      </w:pPr>
-      <w:r>
-        <w:rPr>
-          <w:rFonts w:ascii="微软雅黑" w:hAnsi="微软雅黑" w:eastAsia="微软雅黑" w:hint="eastAsia"/>
-          <w:b w:val="0"/>
-          <w:color w:val="19232D"/>
-          <w:sz w:val="20"/>
-          <w:szCs w:val="20"/>
-        </w:rPr>
-        <w:t xml:space="preserve">面向无人车间的安全防护系统：机械臂等自动化设备运行时，一旦检测到人员进入设备区域，立即输出锁机信号停止设备；负责人员检测与多路相机实时推理、安全状态机与上位机软件开发。</w:t>
-      </w:r>
-    </w:p>
-    <w:p>
-      <w:pPr>
-        <w:spacing w:before="0" w:after="40" w:line="259" w:lineRule="auto"/>
+        <w:spacing w:before="0" w:after="40" w:line="247" w:lineRule="auto"/>
         <w:ind w:left="320" w:hanging="320"/>
       </w:pPr>
       <w:r>
@@ -260,12 +230,12 @@
           <w:sz w:val="20"/>
           <w:szCs w:val="20"/>
         </w:rPr>
-        <w:t xml:space="preserve">YOLOv8 单类人员检测（conf 0.3 / NMS 0.5），2–4 路 1280×720 工业相机并发；推理按「只保留最新帧 + 轮询公平调度 + batch=1」组织，不等待凑批，避免高帧率相机饿死其它路与旧帧堆积。</w:t>
+        <w:t xml:space="preserve">YOLOv8 单类人员检测，2–4 路 1280×720 工业相机并发；推理按「只保留最新帧 + 轮询公平调度 + batch=1」组织，不等待凑批，避免旧帧堆积与相机饥饿。</w:t>
       </w:r>
     </w:p>
     <w:p>
       <w:pPr>
-        <w:spacing w:before="0" w:after="40" w:line="259" w:lineRule="auto"/>
+        <w:spacing w:before="0" w:after="40" w:line="247" w:lineRule="auto"/>
         <w:ind w:left="320" w:hanging="320"/>
       </w:pPr>
       <w:r>
@@ -306,58 +276,12 @@
           <w:sz w:val="20"/>
           <w:szCs w:val="20"/>
         </w:rPr>
-        <w:t xml:space="preserve">以 ModelFactory 统一 backend 与模型协议，同一套业务链可在 PyTorch（CUDA / CPU）、ONNXRuntime CPU、算能 Sophon NPU（bmodel）之间切换，现场按算力选版本。</w:t>
+        <w:t xml:space="preserve">以 ModelFactory 统一 backend 与模型协议，同一套业务链可在 PyTorch（CUDA / CPU）、ONNXRuntime CPU、算能 Sophon NPU 之间切换。</w:t>
       </w:r>
     </w:p>
     <w:p>
       <w:pPr>
-        <w:spacing w:before="0" w:after="40" w:line="259" w:lineRule="auto"/>
-        <w:ind w:left="320" w:hanging="320"/>
-      </w:pPr>
-      <w:r>
-        <w:rPr>
-          <w:rFonts w:ascii="微软雅黑" w:hAnsi="微软雅黑" w:eastAsia="微软雅黑" w:hint="eastAsia"/>
-          <w:b w:val="0"/>
-          <w:color w:val="19232D"/>
-          <w:sz w:val="20"/>
-          <w:szCs w:val="20"/>
-        </w:rPr>
-        <w:t xml:space="preserve">•</w:t>
-      </w:r>
-      <w:r>
-        <w:rPr>
-          <w:rFonts w:ascii="微软雅黑" w:hAnsi="微软雅黑" w:eastAsia="微软雅黑" w:hint="eastAsia"/>
-          <w:b w:val="0"/>
-          <w:color w:val="19232D"/>
-          <w:sz w:val="20"/>
-          <w:szCs w:val="20"/>
-        </w:rPr>
-        <w:tab/>
-      </w:r>
-      <w:r>
-        <w:rPr>
-          <w:rFonts w:ascii="微软雅黑" w:hAnsi="微软雅黑" w:eastAsia="微软雅黑" w:hint="eastAsia"/>
-          <w:b/>
-          <w:color w:val="19232D"/>
-          <w:sz w:val="20"/>
-          <w:szCs w:val="20"/>
-        </w:rPr>
-        <w:t xml:space="preserve">区域与方向判定：</w:t>
-      </w:r>
-      <w:r>
-        <w:rPr>
-          <w:rFonts w:ascii="微软雅黑" w:hAnsi="微软雅黑" w:eastAsia="微软雅黑" w:hint="eastAsia"/>
-          <w:b w:val="0"/>
-          <w:color w:val="19232D"/>
-          <w:sz w:val="20"/>
-          <w:szCs w:val="20"/>
-        </w:rPr>
-        <w:t xml:space="preserve">多边形 ROI 划分 ON / IN / OUT 三区，门区短轨迹状态机按位移投影（可叠加拓扑得分）判定 ENTER / LEAVE，对检测抖动与丢帧容错，输出设备内实时人数与进出净流量。</w:t>
-      </w:r>
-    </w:p>
-    <w:p>
-      <w:pPr>
-        <w:spacing w:before="0" w:after="40" w:line="259" w:lineRule="auto"/>
+        <w:spacing w:before="0" w:after="40" w:line="247" w:lineRule="auto"/>
         <w:ind w:left="320" w:hanging="320"/>
       </w:pPr>
       <w:r>
@@ -398,58 +322,12 @@
           <w:sz w:val="20"/>
           <w:szCs w:val="20"/>
         </w:rPr>
-        <w:t xml:space="preserve">STARTUP_LOCK / PERSON_LOCK / FAULT_LOCK / UNLOCK 状态机：启动默认锁机、检测到人保持锁机、相机 / 推理 / 跟踪 / 计数 / IO 任一模块心跳超时即判故障并强制锁机；复位需同时满足「无人 + 无故障 + 模块健康」并在执行前二次复查。</w:t>
+        <w:t xml:space="preserve">STARTUP / PERSON / FAULT LOCK 状态机 + 心跳超时强制锁机；端到端以 T0 相机取帧 → T1 继电器写入成功 ≤ 200 ms 为验收口径，锁机经 Modbus RTU 输出并保留 DI 软复位。</w:t>
       </w:r>
     </w:p>
     <w:p>
       <w:pPr>
-        <w:spacing w:before="0" w:after="40" w:line="259" w:lineRule="auto"/>
-        <w:ind w:left="320" w:hanging="320"/>
-      </w:pPr>
-      <w:r>
-        <w:rPr>
-          <w:rFonts w:ascii="微软雅黑" w:hAnsi="微软雅黑" w:eastAsia="微软雅黑" w:hint="eastAsia"/>
-          <w:b w:val="0"/>
-          <w:color w:val="19232D"/>
-          <w:sz w:val="20"/>
-          <w:szCs w:val="20"/>
-        </w:rPr>
-        <w:t xml:space="preserve">•</w:t>
-      </w:r>
-      <w:r>
-        <w:rPr>
-          <w:rFonts w:ascii="微软雅黑" w:hAnsi="微软雅黑" w:eastAsia="微软雅黑" w:hint="eastAsia"/>
-          <w:b w:val="0"/>
-          <w:color w:val="19232D"/>
-          <w:sz w:val="20"/>
-          <w:szCs w:val="20"/>
-        </w:rPr>
-        <w:tab/>
-      </w:r>
-      <w:r>
-        <w:rPr>
-          <w:rFonts w:ascii="微软雅黑" w:hAnsi="微软雅黑" w:eastAsia="微软雅黑" w:hint="eastAsia"/>
-          <w:b/>
-          <w:color w:val="19232D"/>
-          <w:sz w:val="20"/>
-          <w:szCs w:val="20"/>
-        </w:rPr>
-        <w:t xml:space="preserve">时延验收与工控联锁：</w:t>
-      </w:r>
-      <w:r>
-        <w:rPr>
-          <w:rFonts w:ascii="微软雅黑" w:hAnsi="微软雅黑" w:eastAsia="微软雅黑" w:hint="eastAsia"/>
-          <w:b w:val="0"/>
-          <w:color w:val="19232D"/>
-          <w:sz w:val="20"/>
-          <w:szCs w:val="20"/>
-        </w:rPr>
-        <w:t xml:space="preserve">端到端以 T0 相机取帧 → T1 继电器写入成功为口径、限值 200 ms，拆成 acquire / scheduler / infer / rule / safety / io 六段统计 p95 / p99 与合格率；锁机经 Modbus RTU 继电器输出并保留 DI 软复位，IO 侧 3 次重试 + 死信队列 + 紧急锁机回调。</w:t>
-      </w:r>
-    </w:p>
-    <w:p>
-      <w:pPr>
-        <w:spacing w:before="60" w:after="120" w:line="252" w:lineRule="auto"/>
+        <w:spacing w:before="40" w:after="80" w:line="252" w:lineRule="auto"/>
       </w:pPr>
       <w:r>
         <w:rPr>
@@ -459,7 +337,7 @@
           <w:sz w:val="19"/>
           <w:szCs w:val="19"/>
         </w:rPr>
-        <w:t xml:space="preserve">技术栈：Python · YOLOv8 · ONNXRuntime / PyTorch · OpenCV · PyQt5 · 多线程/队列 · pyserial（Modbus RTU）· 海康 MVS SDK · PyInstaller</w:t>
+        <w:t xml:space="preserve">技术栈：Python · YOLOv8 · ONNXRuntime / PyTorch · OpenCV · PyQt5 · pyserial（Modbus RTU）· PyInstaller</w:t>
       </w:r>
     </w:p>
     <w:p>
@@ -468,7 +346,7 @@
         <w:tabs>
           <w:tab w:val="right" w:pos="10486"/>
         </w:tabs>
-        <w:spacing w:before="160" w:after="40" w:line="240" w:lineRule="auto"/>
+        <w:spacing w:before="120" w:after="20" w:line="240" w:lineRule="auto"/>
       </w:pPr>
       <w:r>
         <w:rPr>
@@ -503,22 +381,7 @@
     </w:p>
     <w:p>
       <w:pPr>
-        <w:spacing w:before="0" w:after="40" w:line="259" w:lineRule="auto"/>
-      </w:pPr>
-      <w:r>
-        <w:rPr>
-          <w:rFonts w:ascii="微软雅黑" w:hAnsi="微软雅黑" w:eastAsia="微软雅黑" w:hint="eastAsia"/>
-          <w:b w:val="0"/>
-          <w:color w:val="19232D"/>
-          <w:sz w:val="20"/>
-          <w:szCs w:val="20"/>
-        </w:rPr>
-        <w:t xml:space="preserve">面向产线的实时质检系统：红外热成像 + 可见光双相机在线判定包装袋封口质量，NG 由 PLC 驱动剔除机构；负责视觉算法与上位机软件开发。</w:t>
-      </w:r>
-    </w:p>
-    <w:p>
-      <w:pPr>
-        <w:spacing w:before="0" w:after="40" w:line="259" w:lineRule="auto"/>
+        <w:spacing w:before="0" w:after="40" w:line="247" w:lineRule="auto"/>
         <w:ind w:left="320" w:hanging="320"/>
       </w:pPr>
       <w:r>
@@ -559,12 +422,12 @@
           <w:sz w:val="20"/>
           <w:szCs w:val="20"/>
         </w:rPr>
-        <w:t xml:space="preserve">IR 温度矩阵 + RGB 可见光由 PLC 硬触发同帧采集，按采集纳秒戳配对（±100 ms）；设计 OK/NG/UNKNOWN 三态 Fail-Safe，任一路异常一律降级为“不可信”而非误放行。</w:t>
+        <w:t xml:space="preserve">IR 温度矩阵 + RGB 可见光由 PLC 硬触发同帧采集、按纳秒戳配对（±100 ms）；设计 OK / NG / UNKNOWN 三态 Fail-Safe，任一路异常降级为「不可信」而非误放行。</w:t>
       </w:r>
     </w:p>
     <w:p>
       <w:pPr>
-        <w:spacing w:before="0" w:after="40" w:line="259" w:lineRule="auto"/>
+        <w:spacing w:before="0" w:after="40" w:line="247" w:lineRule="auto"/>
         <w:ind w:left="320" w:hanging="320"/>
       </w:pPr>
       <w:r>
@@ -595,7 +458,7 @@
           <w:sz w:val="20"/>
           <w:szCs w:val="20"/>
         </w:rPr>
-        <w:t xml:space="preserve">可见光算法：</w:t>
+        <w:t xml:space="preserve">图像算法：</w:t>
       </w:r>
       <w:r>
         <w:rPr>
@@ -605,104 +468,12 @@
           <w:sz w:val="20"/>
           <w:szCs w:val="20"/>
         </w:rPr>
-        <w:t xml:space="preserve">4 项加权边缘得分图 → 动态规划求解全局最优连续边缘 → 确定性 RANSAC 拟合基准线（内点率 / 覆盖率 / 残差 / 倾角四重质量门）→ 双通道缺陷候选统一判废 + 重叠面积去重。</w:t>
+        <w:t xml:space="preserve">可见光侧动态规划求解全局最优连续边缘 + 确定性 RANSAC 拟合封口基准线；红外侧自适应温度分割 + 逐列几何量测 + MAD 稳健阈值异物检测。</w:t>
       </w:r>
     </w:p>
     <w:p>
       <w:pPr>
-        <w:spacing w:before="0" w:after="40" w:line="259" w:lineRule="auto"/>
-        <w:ind w:left="320" w:hanging="320"/>
-      </w:pPr>
-      <w:r>
-        <w:rPr>
-          <w:rFonts w:ascii="微软雅黑" w:hAnsi="微软雅黑" w:eastAsia="微软雅黑" w:hint="eastAsia"/>
-          <w:b w:val="0"/>
-          <w:color w:val="19232D"/>
-          <w:sz w:val="20"/>
-          <w:szCs w:val="20"/>
-        </w:rPr>
-        <w:t xml:space="preserve">•</w:t>
-      </w:r>
-      <w:r>
-        <w:rPr>
-          <w:rFonts w:ascii="微软雅黑" w:hAnsi="微软雅黑" w:eastAsia="微软雅黑" w:hint="eastAsia"/>
-          <w:b w:val="0"/>
-          <w:color w:val="19232D"/>
-          <w:sz w:val="20"/>
-          <w:szCs w:val="20"/>
-        </w:rPr>
-        <w:tab/>
-      </w:r>
-      <w:r>
-        <w:rPr>
-          <w:rFonts w:ascii="微软雅黑" w:hAnsi="微软雅黑" w:eastAsia="微软雅黑" w:hint="eastAsia"/>
-          <w:b/>
-          <w:color w:val="19232D"/>
-          <w:sz w:val="20"/>
-          <w:szCs w:val="20"/>
-        </w:rPr>
-        <w:t xml:space="preserve">红外算法：</w:t>
-      </w:r>
-      <w:r>
-        <w:rPr>
-          <w:rFonts w:ascii="微软雅黑" w:hAnsi="微软雅黑" w:eastAsia="微软雅黑" w:hint="eastAsia"/>
-          <w:b w:val="0"/>
-          <w:color w:val="19232D"/>
-          <w:sz w:val="20"/>
-          <w:szCs w:val="20"/>
-        </w:rPr>
-        <w:t xml:space="preserve">自适应温度分割（分位数 + 绝对下限兜底）→ 连通域打分 + 粘连 / 圆角结构精化 → 逐列几何测量 → 局部形变检测（短窗 − 长窗中值滤波残差 + 播种扩张）→ 异物检测（局部温度参考 + MAD 稳健阈值）。</w:t>
-      </w:r>
-    </w:p>
-    <w:p>
-      <w:pPr>
-        <w:spacing w:before="0" w:after="40" w:line="259" w:lineRule="auto"/>
-        <w:ind w:left="320" w:hanging="320"/>
-      </w:pPr>
-      <w:r>
-        <w:rPr>
-          <w:rFonts w:ascii="微软雅黑" w:hAnsi="微软雅黑" w:eastAsia="微软雅黑" w:hint="eastAsia"/>
-          <w:b w:val="0"/>
-          <w:color w:val="19232D"/>
-          <w:sz w:val="20"/>
-          <w:szCs w:val="20"/>
-        </w:rPr>
-        <w:t xml:space="preserve">•</w:t>
-      </w:r>
-      <w:r>
-        <w:rPr>
-          <w:rFonts w:ascii="微软雅黑" w:hAnsi="微软雅黑" w:eastAsia="微软雅黑" w:hint="eastAsia"/>
-          <w:b w:val="0"/>
-          <w:color w:val="19232D"/>
-          <w:sz w:val="20"/>
-          <w:szCs w:val="20"/>
-        </w:rPr>
-        <w:tab/>
-      </w:r>
-      <w:r>
-        <w:rPr>
-          <w:rFonts w:ascii="微软雅黑" w:hAnsi="微软雅黑" w:eastAsia="微软雅黑" w:hint="eastAsia"/>
-          <w:b/>
-          <w:color w:val="19232D"/>
-          <w:sz w:val="20"/>
-          <w:szCs w:val="20"/>
-        </w:rPr>
-        <w:t xml:space="preserve">工程化：</w:t>
-      </w:r>
-      <w:r>
-        <w:rPr>
-          <w:rFonts w:ascii="微软雅黑" w:hAnsi="微软雅黑" w:eastAsia="微软雅黑" w:hint="eastAsia"/>
-          <w:b w:val="0"/>
-          <w:color w:val="19232D"/>
-          <w:sz w:val="20"/>
-          <w:szCs w:val="20"/>
-        </w:rPr>
-        <w:t xml:space="preserve">多线程队列流水线（线程池存图、相机健康度重连、PLC 故障自动停机）、判定阈值全配置化热更新；配套离线批量回归工具并记录配置 SHA256 指纹，保证“同图同结论”。</w:t>
-      </w:r>
-    </w:p>
-    <w:p>
-      <w:pPr>
-        <w:spacing w:before="60" w:after="120" w:line="252" w:lineRule="auto"/>
+        <w:spacing w:before="40" w:after="80" w:line="252" w:lineRule="auto"/>
       </w:pPr>
       <w:r>
         <w:rPr>
@@ -712,7 +483,7 @@
           <w:sz w:val="19"/>
           <w:szCs w:val="19"/>
         </w:rPr>
-        <w:t xml:space="preserve">技术栈：Python · OpenCV · NumPy · PyQt5 · 多线程/队列 · pyserial（Modbus RTU）· C 接口 SDK 封装（ctypes）· PyInstaller</w:t>
+        <w:t xml:space="preserve">技术栈：Python · OpenCV · NumPy · PyQt5 · 多线程/队列 · pyserial（Modbus RTU）· PyInstaller</w:t>
       </w:r>
     </w:p>
     <w:p>
@@ -721,7 +492,7 @@
         <w:tabs>
           <w:tab w:val="right" w:pos="10486"/>
         </w:tabs>
-        <w:spacing w:before="160" w:after="40" w:line="240" w:lineRule="auto"/>
+        <w:spacing w:before="120" w:after="20" w:line="240" w:lineRule="auto"/>
       </w:pPr>
       <w:r>
         <w:rPr>
@@ -756,22 +527,7 @@
     </w:p>
     <w:p>
       <w:pPr>
-        <w:spacing w:before="0" w:after="40" w:line="259" w:lineRule="auto"/>
-      </w:pPr>
-      <w:r>
-        <w:rPr>
-          <w:rFonts w:ascii="微软雅黑" w:hAnsi="微软雅黑" w:eastAsia="微软雅黑" w:hint="eastAsia"/>
-          <w:b w:val="0"/>
-          <w:color w:val="19232D"/>
-          <w:sz w:val="20"/>
-          <w:szCs w:val="20"/>
-        </w:rPr>
-        <w:t xml:space="preserve">面向烟标印刷缺陷检测的端侧质检应用：负责算法迁移、端侧工程实现与真机验收。</w:t>
-      </w:r>
-    </w:p>
-    <w:p>
-      <w:pPr>
-        <w:spacing w:before="0" w:after="40" w:line="259" w:lineRule="auto"/>
+        <w:spacing w:before="0" w:after="40" w:line="247" w:lineRule="auto"/>
         <w:ind w:left="320" w:hanging="320"/>
       </w:pPr>
       <w:r>
@@ -802,7 +558,7 @@
           <w:sz w:val="20"/>
           <w:szCs w:val="20"/>
         </w:rPr>
-        <w:t xml:space="preserve">端侧迁移主线：</w:t>
+        <w:t xml:space="preserve">端侧迁移与验收：</w:t>
       </w:r>
       <w:r>
         <w:rPr>
@@ -812,12 +568,12 @@
           <w:sz w:val="20"/>
           <w:szCs w:val="20"/>
         </w:rPr>
-        <w:t xml:space="preserve">主导检测算法从 PC 端迁移到鸿蒙手机端，按「PC 黄金测试集固化 → NAPI 链路打通 → C++ 全量移植 → 真机一致性验收」四阶段推进；建立 17 张真值图的黄金测试集与缺陷级一致性判据（NCC 容差常规 ±0.03 / 难图 ±0.10），自动化验收通过，真机单张 11~75 s。</w:t>
+        <w:t xml:space="preserve">主导算法从 PC 端迁移到鸿蒙手机端，按「黄金测试集固化 → NAPI 链路打通 → C++ 全量移植 → 真机一致性验收」推进；17 张真值图自动化验收通过，真机单张 11–75 s。</w:t>
       </w:r>
     </w:p>
     <w:p>
       <w:pPr>
-        <w:spacing w:before="0" w:after="40" w:line="259" w:lineRule="auto"/>
+        <w:spacing w:before="0" w:after="40" w:line="247" w:lineRule="auto"/>
         <w:ind w:left="320" w:hanging="320"/>
       </w:pPr>
       <w:r>
@@ -848,7 +604,7 @@
           <w:sz w:val="20"/>
           <w:szCs w:val="20"/>
         </w:rPr>
-        <w:t xml:space="preserve">检测能力：</w:t>
+        <w:t xml:space="preserve">算法与端侧工程：</w:t>
       </w:r>
       <w:r>
         <w:rPr>
@@ -858,196 +614,12 @@
           <w:sz w:val="20"/>
           <w:szCs w:val="20"/>
         </w:rPr>
-        <w:t xml:space="preserve">实现 9 级检测流水线（主通道 → 淡红晕染 → 墨点 → 轻微墨点 → 轻微划痕 → 弱线 → 脏点团块 → 脏斑 → 跨通道去重），覆盖复杂背景下的文字行印刷检测、印刷图标 Logo 缺陷、Logo 烫金激凸套印与脏点污点类检测；判据统一收敛到物理尺寸口径（1 px ≈ 0.0495 mm，最小可检 0.5 mm），输出可直接对接质检标准。</w:t>
+        <w:t xml:space="preserve">9 级检测流水线，判据统一收敛到物理量纲（1 px ≈ 0.0495 mm、最小可检 0.5 mm）；OpenCV 5.0 静态编译进 HAP，检测经 TaskPool 异步执行避免阻塞 UI。</w:t>
       </w:r>
     </w:p>
     <w:p>
       <w:pPr>
-        <w:spacing w:before="0" w:after="40" w:line="259" w:lineRule="auto"/>
-        <w:ind w:left="320" w:hanging="320"/>
-      </w:pPr>
-      <w:r>
-        <w:rPr>
-          <w:rFonts w:ascii="微软雅黑" w:hAnsi="微软雅黑" w:eastAsia="微软雅黑" w:hint="eastAsia"/>
-          <w:b w:val="0"/>
-          <w:color w:val="19232D"/>
-          <w:sz w:val="20"/>
-          <w:szCs w:val="20"/>
-        </w:rPr>
-        <w:t xml:space="preserve">•</w:t>
-      </w:r>
-      <w:r>
-        <w:rPr>
-          <w:rFonts w:ascii="微软雅黑" w:hAnsi="微软雅黑" w:eastAsia="微软雅黑" w:hint="eastAsia"/>
-          <w:b w:val="0"/>
-          <w:color w:val="19232D"/>
-          <w:sz w:val="20"/>
-          <w:szCs w:val="20"/>
-        </w:rPr>
-        <w:tab/>
-      </w:r>
-      <w:r>
-        <w:rPr>
-          <w:rFonts w:ascii="微软雅黑" w:hAnsi="微软雅黑" w:eastAsia="微软雅黑" w:hint="eastAsia"/>
-          <w:b/>
-          <w:color w:val="19232D"/>
-          <w:sz w:val="20"/>
-          <w:szCs w:val="20"/>
-        </w:rPr>
-        <w:t xml:space="preserve">配准与光照校正：</w:t>
-      </w:r>
-      <w:r>
-        <w:rPr>
-          <w:rFonts w:ascii="微软雅黑" w:hAnsi="微软雅黑" w:eastAsia="微软雅黑" w:hint="eastAsia"/>
-          <w:b w:val="0"/>
-          <w:color w:val="19232D"/>
-          <w:sz w:val="20"/>
-          <w:szCs w:val="20"/>
-        </w:rPr>
-        <w:t xml:space="preserve">以 ORB + RANSAC 单应性替代相位相关，跨样张对齐 NCC 由 0.445 提升至 0.686（+54%）；低频增益校正把光照残差均值压到 11.0（对比直方图匹配 16.5、CLAHE 26.6）。</w:t>
-      </w:r>
-    </w:p>
-    <w:p>
-      <w:pPr>
-        <w:spacing w:before="0" w:after="40" w:line="259" w:lineRule="auto"/>
-        <w:ind w:left="320" w:hanging="320"/>
-      </w:pPr>
-      <w:r>
-        <w:rPr>
-          <w:rFonts w:ascii="微软雅黑" w:hAnsi="微软雅黑" w:eastAsia="微软雅黑" w:hint="eastAsia"/>
-          <w:b w:val="0"/>
-          <w:color w:val="19232D"/>
-          <w:sz w:val="20"/>
-          <w:szCs w:val="20"/>
-        </w:rPr>
-        <w:t xml:space="preserve">•</w:t>
-      </w:r>
-      <w:r>
-        <w:rPr>
-          <w:rFonts w:ascii="微软雅黑" w:hAnsi="微软雅黑" w:eastAsia="微软雅黑" w:hint="eastAsia"/>
-          <w:b w:val="0"/>
-          <w:color w:val="19232D"/>
-          <w:sz w:val="20"/>
-          <w:szCs w:val="20"/>
-        </w:rPr>
-        <w:tab/>
-      </w:r>
-      <w:r>
-        <w:rPr>
-          <w:rFonts w:ascii="微软雅黑" w:hAnsi="微软雅黑" w:eastAsia="微软雅黑" w:hint="eastAsia"/>
-          <w:b/>
-          <w:color w:val="19232D"/>
-          <w:sz w:val="20"/>
-          <w:szCs w:val="20"/>
-        </w:rPr>
-        <w:t xml:space="preserve">轮廓提取与误报控制：</w:t>
-      </w:r>
-      <w:r>
-        <w:rPr>
-          <w:rFonts w:ascii="微软雅黑" w:hAnsi="微软雅黑" w:eastAsia="微软雅黑" w:hint="eastAsia"/>
-          <w:b w:val="0"/>
-          <w:color w:val="19232D"/>
-          <w:sz w:val="20"/>
-          <w:szCs w:val="20"/>
-        </w:rPr>
-        <w:t xml:space="preserve">「Otsu 自适应阈值 + 保角点多边形拟合」提取不规则烟标轮廓，与人工标注掩码 IoU 达 0.9968、边界平均偏差 0.84 px；配合边缘密度阈值 0.20 与最小物理边长过滤，模板自比对 0 误报。</w:t>
-      </w:r>
-    </w:p>
-    <w:p>
-      <w:pPr>
-        <w:spacing w:before="0" w:after="40" w:line="259" w:lineRule="auto"/>
-        <w:ind w:left="320" w:hanging="320"/>
-      </w:pPr>
-      <w:r>
-        <w:rPr>
-          <w:rFonts w:ascii="微软雅黑" w:hAnsi="微软雅黑" w:eastAsia="微软雅黑" w:hint="eastAsia"/>
-          <w:b w:val="0"/>
-          <w:color w:val="19232D"/>
-          <w:sz w:val="20"/>
-          <w:szCs w:val="20"/>
-        </w:rPr>
-        <w:t xml:space="preserve">•</w:t>
-      </w:r>
-      <w:r>
-        <w:rPr>
-          <w:rFonts w:ascii="微软雅黑" w:hAnsi="微软雅黑" w:eastAsia="微软雅黑" w:hint="eastAsia"/>
-          <w:b w:val="0"/>
-          <w:color w:val="19232D"/>
-          <w:sz w:val="20"/>
-          <w:szCs w:val="20"/>
-        </w:rPr>
-        <w:tab/>
-      </w:r>
-      <w:r>
-        <w:rPr>
-          <w:rFonts w:ascii="微软雅黑" w:hAnsi="微软雅黑" w:eastAsia="微软雅黑" w:hint="eastAsia"/>
-          <w:b/>
-          <w:color w:val="19232D"/>
-          <w:sz w:val="20"/>
-          <w:szCs w:val="20"/>
-        </w:rPr>
-        <w:t xml:space="preserve">端侧工程与系统配套：</w:t>
-      </w:r>
-      <w:r>
-        <w:rPr>
-          <w:rFonts w:ascii="微软雅黑" w:hAnsi="微软雅黑" w:eastAsia="微软雅黑" w:hint="eastAsia"/>
-          <w:b w:val="0"/>
-          <w:color w:val="19232D"/>
-          <w:sz w:val="20"/>
-          <w:szCs w:val="20"/>
-        </w:rPr>
-        <w:t xml:space="preserve">鸿蒙端以 ArkTS + ArkUI（Stage 模型）实现样本库管理、拍照检测、结果判定与历史管理，OpenCV 5.0 静态编译进 HAP（arm64-v8a / x86_64），检测经 TaskPool 异步执行避免阻塞 UI；完成管理员 / 操作员双角色登录与差异化访问权限管理，支持按天生成 Excel 检测报表并通过 FTP 自动上传。</w:t>
-      </w:r>
-    </w:p>
-    <w:p>
-      <w:pPr>
-        <w:spacing w:before="0" w:after="40" w:line="259" w:lineRule="auto"/>
-        <w:ind w:left="320" w:hanging="320"/>
-      </w:pPr>
-      <w:r>
-        <w:rPr>
-          <w:rFonts w:ascii="微软雅黑" w:hAnsi="微软雅黑" w:eastAsia="微软雅黑" w:hint="eastAsia"/>
-          <w:b w:val="0"/>
-          <w:color w:val="19232D"/>
-          <w:sz w:val="20"/>
-          <w:szCs w:val="20"/>
-        </w:rPr>
-        <w:t xml:space="preserve">•</w:t>
-      </w:r>
-      <w:r>
-        <w:rPr>
-          <w:rFonts w:ascii="微软雅黑" w:hAnsi="微软雅黑" w:eastAsia="微软雅黑" w:hint="eastAsia"/>
-          <w:b w:val="0"/>
-          <w:color w:val="19232D"/>
-          <w:sz w:val="20"/>
-          <w:szCs w:val="20"/>
-        </w:rPr>
-        <w:tab/>
-      </w:r>
-      <w:r>
-        <w:rPr>
-          <w:rFonts w:ascii="微软雅黑" w:hAnsi="微软雅黑" w:eastAsia="微软雅黑" w:hint="eastAsia"/>
-          <w:b/>
-          <w:color w:val="19232D"/>
-          <w:sz w:val="20"/>
-          <w:szCs w:val="20"/>
-        </w:rPr>
-        <w:t xml:space="preserve">算法库化：</w:t>
-      </w:r>
-      <w:r>
-        <w:rPr>
-          <w:rFonts w:ascii="微软雅黑" w:hAnsi="微软雅黑" w:eastAsia="微软雅黑" w:hint="eastAsia"/>
-          <w:b w:val="0"/>
-          <w:color w:val="19232D"/>
-          <w:sz w:val="20"/>
-          <w:szCs w:val="20"/>
-        </w:rPr>
-        <w:t xml:space="preserve">把六套检测方法封装为自包含 Python 类（无绝对路径依赖），以 Otsu 自适应阈值 + 保角点多边形 ROI + SIFT 单应性配准作公共底座；与原始工程逐值核对，5 个方法的检出数量与面积完全一致。</w:t>
-      </w:r>
-    </w:p>
-    <w:p>
-      <w:pPr>
-        <w:spacing w:before="60" w:after="120" w:line="252" w:lineRule="auto"/>
+        <w:spacing w:before="40" w:after="80" w:line="252" w:lineRule="auto"/>
       </w:pPr>
       <w:r>
         <w:rPr>
@@ -1057,7 +629,7 @@
           <w:sz w:val="19"/>
           <w:szCs w:val="19"/>
         </w:rPr>
-        <w:t xml:space="preserve">技术栈：ArkTS · HarmonyOS · Native NAPI · C++</w:t>
+        <w:t xml:space="preserve">技术栈：ArkTS · HarmonyOS · Native NAPI · C++ · OpenCV 5.0</w:t>
       </w:r>
     </w:p>
     <w:p>
@@ -1066,7 +638,7 @@
         <w:pBdr>
           <w:bottom w:val="single" w:color="D9DDE4" w:sz="8" w:space="2"/>
         </w:pBdr>
-        <w:spacing w:before="200" w:after="80" w:line="240" w:lineRule="auto"/>
+        <w:spacing w:before="140" w:after="60" w:line="240" w:lineRule="auto"/>
       </w:pPr>
       <w:r>
         <w:rPr>
@@ -1085,7 +657,7 @@
         <w:tabs>
           <w:tab w:val="right" w:pos="10486"/>
         </w:tabs>
-        <w:spacing w:before="120" w:after="40" w:line="240" w:lineRule="auto"/>
+        <w:spacing w:before="100" w:after="40" w:line="240" w:lineRule="auto"/>
       </w:pPr>
       <w:r>
         <w:rPr>
@@ -1120,7 +692,7 @@
     </w:p>
     <w:p>
       <w:pPr>
-        <w:spacing w:before="0" w:after="40" w:line="259" w:lineRule="auto"/>
+        <w:spacing w:before="0" w:after="40" w:line="247" w:lineRule="auto"/>
         <w:ind w:left="320" w:hanging="320"/>
       </w:pPr>
       <w:r>
@@ -1151,12 +723,12 @@
           <w:sz w:val="20"/>
           <w:szCs w:val="20"/>
         </w:rPr>
-        <w:t xml:space="preserve">2026 第十三届 PAC 并行应用挑战赛华南赛区一等奖</w:t>
+        <w:t xml:space="preserve">2026 第十三届 PAC 并行应用挑战赛华南赛区一等奖；第十九届中国大学生计算机设计大赛中南地区赛三等奖</w:t>
       </w:r>
     </w:p>
     <w:p>
       <w:pPr>
-        <w:spacing w:before="0" w:after="40" w:line="259" w:lineRule="auto"/>
+        <w:spacing w:before="0" w:after="40" w:line="247" w:lineRule="auto"/>
         <w:ind w:left="320" w:hanging="320"/>
       </w:pPr>
       <w:r>
@@ -1187,157 +759,13 @@
           <w:sz w:val="20"/>
           <w:szCs w:val="20"/>
         </w:rPr>
-        <w:t xml:space="preserve">2026 第十九届中国大学生计算机设计大赛中南地区赛三等奖</w:t>
-      </w:r>
-    </w:p>
-    <w:p>
-      <w:pPr>
-        <w:spacing w:before="0" w:after="40" w:line="259" w:lineRule="auto"/>
-        <w:ind w:left="320" w:hanging="320"/>
-      </w:pPr>
-      <w:r>
-        <w:rPr>
-          <w:rFonts w:ascii="微软雅黑" w:hAnsi="微软雅黑" w:eastAsia="微软雅黑" w:hint="eastAsia"/>
-          <w:b w:val="0"/>
-          <w:color w:val="19232D"/>
-          <w:sz w:val="20"/>
-          <w:szCs w:val="20"/>
-        </w:rPr>
-        <w:t xml:space="preserve">•</w:t>
-      </w:r>
-      <w:r>
-        <w:rPr>
-          <w:rFonts w:ascii="微软雅黑" w:hAnsi="微软雅黑" w:eastAsia="微软雅黑" w:hint="eastAsia"/>
-          <w:b w:val="0"/>
-          <w:color w:val="19232D"/>
-          <w:sz w:val="20"/>
-          <w:szCs w:val="20"/>
-        </w:rPr>
-        <w:tab/>
-      </w:r>
-      <w:r>
-        <w:rPr>
-          <w:rFonts w:ascii="微软雅黑" w:hAnsi="微软雅黑" w:eastAsia="微软雅黑" w:hint="eastAsia"/>
-          <w:b/>
-          <w:color w:val="19232D"/>
-          <w:sz w:val="20"/>
-          <w:szCs w:val="20"/>
-        </w:rPr>
-        <w:t xml:space="preserve">2026 湖南大学新文科实践创新大赛校级铜奖</w:t>
-      </w:r>
-    </w:p>
-    <w:p>
-      <w:pPr>
-        <w:spacing w:before="0" w:after="40" w:line="259" w:lineRule="auto"/>
-        <w:ind w:left="320" w:hanging="320"/>
-      </w:pPr>
-      <w:r>
-        <w:rPr>
-          <w:rFonts w:ascii="微软雅黑" w:hAnsi="微软雅黑" w:eastAsia="微软雅黑" w:hint="eastAsia"/>
-          <w:b w:val="0"/>
-          <w:color w:val="19232D"/>
-          <w:sz w:val="20"/>
-          <w:szCs w:val="20"/>
-        </w:rPr>
-        <w:t xml:space="preserve">•</w:t>
-      </w:r>
-      <w:r>
-        <w:rPr>
-          <w:rFonts w:ascii="微软雅黑" w:hAnsi="微软雅黑" w:eastAsia="微软雅黑" w:hint="eastAsia"/>
-          <w:b w:val="0"/>
-          <w:color w:val="19232D"/>
-          <w:sz w:val="20"/>
-          <w:szCs w:val="20"/>
-        </w:rPr>
-        <w:tab/>
-      </w:r>
-      <w:r>
-        <w:rPr>
-          <w:rFonts w:ascii="微软雅黑" w:hAnsi="微软雅黑" w:eastAsia="微软雅黑" w:hint="eastAsia"/>
-          <w:b/>
-          <w:color w:val="19232D"/>
-          <w:sz w:val="20"/>
-          <w:szCs w:val="20"/>
-        </w:rPr>
-        <w:t xml:space="preserve">第十九届“挑战杯”校赛三等奖</w:t>
-      </w:r>
-    </w:p>
-    <w:p>
-      <w:pPr>
-        <w:spacing w:before="0" w:after="40" w:line="259" w:lineRule="auto"/>
-        <w:ind w:left="320" w:hanging="320"/>
-      </w:pPr>
-      <w:r>
-        <w:rPr>
-          <w:rFonts w:ascii="微软雅黑" w:hAnsi="微软雅黑" w:eastAsia="微软雅黑" w:hint="eastAsia"/>
-          <w:b w:val="0"/>
-          <w:color w:val="19232D"/>
-          <w:sz w:val="20"/>
-          <w:szCs w:val="20"/>
-        </w:rPr>
-        <w:t xml:space="preserve">•</w:t>
-      </w:r>
-      <w:r>
-        <w:rPr>
-          <w:rFonts w:ascii="微软雅黑" w:hAnsi="微软雅黑" w:eastAsia="微软雅黑" w:hint="eastAsia"/>
-          <w:b w:val="0"/>
-          <w:color w:val="19232D"/>
-          <w:sz w:val="20"/>
-          <w:szCs w:val="20"/>
-        </w:rPr>
-        <w:tab/>
-      </w:r>
-      <w:r>
-        <w:rPr>
-          <w:rFonts w:ascii="微软雅黑" w:hAnsi="微软雅黑" w:eastAsia="微软雅黑" w:hint="eastAsia"/>
-          <w:b/>
-          <w:color w:val="19232D"/>
-          <w:sz w:val="20"/>
-          <w:szCs w:val="20"/>
-        </w:rPr>
-        <w:t xml:space="preserve">2025—2026 年度优秀志愿者（志愿时长 150 小时）</w:t>
-      </w:r>
-    </w:p>
-    <w:p>
-      <w:pPr>
-        <w:spacing w:before="0" w:after="40" w:line="259" w:lineRule="auto"/>
-        <w:ind w:left="320" w:hanging="320"/>
-      </w:pPr>
-      <w:r>
-        <w:rPr>
-          <w:rFonts w:ascii="微软雅黑" w:hAnsi="微软雅黑" w:eastAsia="微软雅黑" w:hint="eastAsia"/>
-          <w:b w:val="0"/>
-          <w:color w:val="19232D"/>
-          <w:sz w:val="20"/>
-          <w:szCs w:val="20"/>
-        </w:rPr>
-        <w:t xml:space="preserve">•</w:t>
-      </w:r>
-      <w:r>
-        <w:rPr>
-          <w:rFonts w:ascii="微软雅黑" w:hAnsi="微软雅黑" w:eastAsia="微软雅黑" w:hint="eastAsia"/>
-          <w:b w:val="0"/>
-          <w:color w:val="19232D"/>
-          <w:sz w:val="20"/>
-          <w:szCs w:val="20"/>
-        </w:rPr>
-        <w:tab/>
-      </w:r>
-      <w:r>
-        <w:rPr>
-          <w:rFonts w:ascii="微软雅黑" w:hAnsi="微软雅黑" w:eastAsia="微软雅黑" w:hint="eastAsia"/>
-          <w:b/>
-          <w:color w:val="19232D"/>
-          <w:sz w:val="20"/>
-          <w:szCs w:val="20"/>
-        </w:rPr>
-        <w:t xml:space="preserve">论文 PD-CAT 2026 国际会议在审（并行三维网格生成）；软件著作权登记已受理（2026R11L1069227）、专利在审</w:t>
+        <w:t xml:space="preserve">论文 PD-CAT 2026 国际会议在审；软件著作权已受理、专利在审；优秀志愿者（150 小时）</w:t>
       </w:r>
     </w:p>
     <w:p>
       <w:pPr>
         <w:keepNext/>
-        <w:spacing w:before="160" w:after="40" w:line="240" w:lineRule="auto"/>
+        <w:spacing w:before="120" w:after="40" w:line="240" w:lineRule="auto"/>
       </w:pPr>
       <w:r>
         <w:rPr>
@@ -1352,7 +780,7 @@
     </w:p>
     <w:p>
       <w:pPr>
-        <w:spacing w:before="0" w:after="40" w:line="259" w:lineRule="auto"/>
+        <w:spacing w:before="0" w:after="40" w:line="247" w:lineRule="auto"/>
         <w:ind w:left="320" w:hanging="320"/>
       </w:pPr>
       <w:r>
@@ -1398,7 +826,7 @@
     </w:p>
     <w:p>
       <w:pPr>
-        <w:spacing w:before="0" w:after="40" w:line="259" w:lineRule="auto"/>
+        <w:spacing w:before="0" w:after="40" w:line="247" w:lineRule="auto"/>
         <w:ind w:left="320" w:hanging="320"/>
       </w:pPr>
       <w:r>
@@ -1429,7 +857,7 @@
           <w:sz w:val="20"/>
           <w:szCs w:val="20"/>
         </w:rPr>
-        <w:t xml:space="preserve">模型部署与推理：</w:t>
+        <w:t xml:space="preserve">模型部署与工程：</w:t>
       </w:r>
       <w:r>
         <w:rPr>
@@ -1439,99 +867,7 @@
           <w:sz w:val="20"/>
           <w:szCs w:val="20"/>
         </w:rPr>
-        <w:t xml:space="preserve">PyTorch、ONNXRuntime、多路视频实时推理（latest-frame / 轮询调度）、Modbus RTU 工控联锁</w:t>
-      </w:r>
-    </w:p>
-    <w:p>
-      <w:pPr>
-        <w:spacing w:before="0" w:after="40" w:line="259" w:lineRule="auto"/>
-        <w:ind w:left="320" w:hanging="320"/>
-      </w:pPr>
-      <w:r>
-        <w:rPr>
-          <w:rFonts w:ascii="微软雅黑" w:hAnsi="微软雅黑" w:eastAsia="微软雅黑" w:hint="eastAsia"/>
-          <w:b w:val="0"/>
-          <w:color w:val="19232D"/>
-          <w:sz w:val="20"/>
-          <w:szCs w:val="20"/>
-        </w:rPr>
-        <w:t xml:space="preserve">•</w:t>
-      </w:r>
-      <w:r>
-        <w:rPr>
-          <w:rFonts w:ascii="微软雅黑" w:hAnsi="微软雅黑" w:eastAsia="微软雅黑" w:hint="eastAsia"/>
-          <w:b w:val="0"/>
-          <w:color w:val="19232D"/>
-          <w:sz w:val="20"/>
-          <w:szCs w:val="20"/>
-        </w:rPr>
-        <w:tab/>
-      </w:r>
-      <w:r>
-        <w:rPr>
-          <w:rFonts w:ascii="微软雅黑" w:hAnsi="微软雅黑" w:eastAsia="微软雅黑" w:hint="eastAsia"/>
-          <w:b/>
-          <w:color w:val="19232D"/>
-          <w:sz w:val="20"/>
-          <w:szCs w:val="20"/>
-        </w:rPr>
-        <w:t xml:space="preserve">端侧与并行计算：</w:t>
-      </w:r>
-      <w:r>
-        <w:rPr>
-          <w:rFonts w:ascii="微软雅黑" w:hAnsi="微软雅黑" w:eastAsia="微软雅黑" w:hint="eastAsia"/>
-          <w:b w:val="0"/>
-          <w:color w:val="19232D"/>
-          <w:sz w:val="20"/>
-          <w:szCs w:val="20"/>
-        </w:rPr>
-        <w:t xml:space="preserve">ArkTS / HarmonyOS、Native NAPI、MPI、Kokkos、Linux / Slurm</w:t>
-      </w:r>
-    </w:p>
-    <w:p>
-      <w:pPr>
-        <w:spacing w:before="0" w:after="40" w:line="259" w:lineRule="auto"/>
-        <w:ind w:left="320" w:hanging="320"/>
-      </w:pPr>
-      <w:r>
-        <w:rPr>
-          <w:rFonts w:ascii="微软雅黑" w:hAnsi="微软雅黑" w:eastAsia="微软雅黑" w:hint="eastAsia"/>
-          <w:b w:val="0"/>
-          <w:color w:val="19232D"/>
-          <w:sz w:val="20"/>
-          <w:szCs w:val="20"/>
-        </w:rPr>
-        <w:t xml:space="preserve">•</w:t>
-      </w:r>
-      <w:r>
-        <w:rPr>
-          <w:rFonts w:ascii="微软雅黑" w:hAnsi="微软雅黑" w:eastAsia="微软雅黑" w:hint="eastAsia"/>
-          <w:b w:val="0"/>
-          <w:color w:val="19232D"/>
-          <w:sz w:val="20"/>
-          <w:szCs w:val="20"/>
-        </w:rPr>
-        <w:tab/>
-      </w:r>
-      <w:r>
-        <w:rPr>
-          <w:rFonts w:ascii="微软雅黑" w:hAnsi="微软雅黑" w:eastAsia="微软雅黑" w:hint="eastAsia"/>
-          <w:b/>
-          <w:color w:val="19232D"/>
-          <w:sz w:val="20"/>
-          <w:szCs w:val="20"/>
-        </w:rPr>
-        <w:t xml:space="preserve">工程与工具：</w:t>
-      </w:r>
-      <w:r>
-        <w:rPr>
-          <w:rFonts w:ascii="微软雅黑" w:hAnsi="微软雅黑" w:eastAsia="微软雅黑" w:hint="eastAsia"/>
-          <w:b w:val="0"/>
-          <w:color w:val="19232D"/>
-          <w:sz w:val="20"/>
-          <w:szCs w:val="20"/>
-        </w:rPr>
-        <w:t xml:space="preserve">PyQt5、Git、PyInstaller、pyserial</w:t>
+        <w:t xml:space="preserve">PyTorch / ONNXRuntime、多路实时推理、Modbus RTU、PyQt5、ArkTS / HarmonyOS</w:t>
       </w:r>
     </w:p>
   </w:body>

</xml_diff>

<commit_message>
Correct wording (test-set verification) and mark HarmonyOS app as not yet launched
</commit_message>
<xml_diff>
--- a/assets/resume.docx
+++ b/assets/resume.docx
@@ -502,7 +502,7 @@
           <w:sz w:val="23"/>
           <w:szCs w:val="23"/>
         </w:rPr>
-        <w:t xml:space="preserve">烟标质检助手 · HarmonyOS App（校企合作 · 已商用上线）</w:t>
+        <w:t xml:space="preserve">烟标质检助手 · HarmonyOS App（校企合作 · 已通过真机验收）</w:t>
       </w:r>
       <w:r>
         <w:rPr>
@@ -568,7 +568,7 @@
           <w:sz w:val="20"/>
           <w:szCs w:val="20"/>
         </w:rPr>
-        <w:t xml:space="preserve">主导算法从 PC 端迁移到鸿蒙手机端，按「黄金测试集固化 → NAPI 链路打通 → C++ 全量移植 → 真机一致性验收」推进；17 张真值图自动化验收通过，真机单张 11–75 s。</w:t>
+        <w:t xml:space="preserve">主导算法从 PC 端迁移到鸿蒙手机端，按「测试集验证 → NAPI 链路打通 → C++ 全量移植 → 真机一致性验收」推进；17 张真值图自动化验收通过，真机单张 11–75 s。</w:t>
       </w:r>
     </w:p>
     <w:p>

</xml_diff>